<commit_message>
UroMetabR 1.0.0: trials on real sets A/B/V and module 1 (Docker), selection without EigenMS, strict profile; explanatory note, registration kit, listing, archive
Co-Authored-By: Claude Opus 5.5 <noreply@anthropic.com>
Claude-Session: https://claude.ai/code/session_013Wpb2gRPMcSAyp5VyyUtQh
</commit_message>
<xml_diff>
--- a/dist/UroMetabR_v1.0.0_komplekt_registracii.docx
+++ b/dist/UroMetabR_v1.0.0_komplekt_registracii.docx
@@ -305,7 +305,7 @@
                 <w:sz w:val="20"/>
                 <w:szCs w:val="20"/>
               </w:rPr>
-              <w:t xml:space="preserve">0 — загрузка и проверка входных данных (mzML, mzXML, CDF, CSV, TSV, TXT, экспорт MS-DIAL) и метаданных; 1 — оптимизация параметров и построение таблицы пиков (xcms, IPO); 2 — контроль качества (PCA с образцами QC, доля пропусков, TIC, RSD); 3 — фильтр устойчивых признаков; 4 — удаление QC, усреднение повторных измерений, сортировка по порядку ввода; 5 — заполнение пропусков случайным лесом; 6 — коррекция систематической ошибки сигнала (EigenMS) и логарифмирование; 7 — одномерный статистический фильтр, четыре модели машинного обучения, отбор по частоте встречаемости, рекурсивный отбор переменных, вложенная кросс-валидация; 8 — визуализация (PCA, иерархическая кластеризация, тепловые карты, диаграммы размаха, PLS-DA с VIP); 9 — пополнение базы метаболомных признаков и формирование HTML-отчёта. Графический интерфейс (Shiny) и запуск из командной строки.</w:t>
+              <w:t xml:space="preserve">0 — загрузка и проверка входных данных (mzML, mzXML, CDF, CSV, TSV, TXT, экспорт MS-DIAL) и метаданных; 1 — оптимизация параметров и построение таблицы пиков (xcms, IPO); 2 — контроль качества (PCA с образцами QC, доля пропусков, TIC, RSD); 3 — фильтр устойчивых признаков (стандартный профиль для анализа и строгий профиль для базы признаков); 4 — удаление QC, усреднение повторных измерений, сортировка по порядку ввода; 5 — заполнение пропусков случайным лесом; 6 — коррекция систематической ошибки сигнала (EigenMS) и логарифмирование; 7 — одномерный статистический фильтр, четыре модели машинного обучения, отбор по частоте встречаемости, рекурсивный отбор переменных, вложенная кросс-валидация; 8 — визуализация (PCA, иерархическая кластеризация, тепловые карты, диаграммы размаха, PLS-DA с VIP); 9 — пополнение базы метаболомных признаков (сигналы, устойчивые во всех образцах) и формирование HTML-отчёта. Графический интерфейс (Shiny) и запуск из командной строки.</w:t>
             </w:r>
           </w:p>
         </w:tc>
@@ -521,7 +521,7 @@
                 <w:sz w:val="20"/>
                 <w:szCs w:val="20"/>
               </w:rPr>
-              <w:t xml:space="preserve">100,8 КБ исходного кода (16 файлов, 1376 строк); с тестами и генераторами контрольных данных — 135,5 КБ (20 файлов)</w:t>
+              <w:t xml:space="preserve">117 260 байт (114,5 КБ) исходного кода: 17 файлов, 1448 строк; с тестами и генераторами контрольных данных — 162,6 КБ (22 файлов)</w:t>
             </w:r>
           </w:p>
         </w:tc>
@@ -4435,7 +4435,7 @@
                 <w:sz w:val="20"/>
                 <w:szCs w:val="20"/>
               </w:rPr>
-              <w:t xml:space="preserve">Размер, КБ</w:t>
+              <w:t xml:space="preserve">Размер, байт</w:t>
             </w:r>
           </w:p>
         </w:tc>
@@ -4543,7 +4543,7 @@
                 <w:sz w:val="20"/>
                 <w:szCs w:val="20"/>
               </w:rPr>
-              <w:t xml:space="preserve">0,4</w:t>
+              <w:t xml:space="preserve">370</w:t>
             </w:r>
           </w:p>
         </w:tc>
@@ -4569,7 +4569,7 @@
                 <w:sz w:val="20"/>
                 <w:szCs w:val="20"/>
               </w:rPr>
-              <w:t xml:space="preserve">9</w:t>
+              <w:t xml:space="preserve">8</w:t>
             </w:r>
           </w:p>
         </w:tc>
@@ -4649,7 +4649,7 @@
                 <w:sz w:val="20"/>
                 <w:szCs w:val="20"/>
               </w:rPr>
-              <w:t xml:space="preserve">13,2</w:t>
+              <w:t xml:space="preserve">14300</w:t>
             </w:r>
           </w:p>
         </w:tc>
@@ -4675,7 +4675,7 @@
                 <w:sz w:val="20"/>
                 <w:szCs w:val="20"/>
               </w:rPr>
-              <w:t xml:space="preserve">229</w:t>
+              <w:t xml:space="preserve">234</w:t>
             </w:r>
           </w:p>
         </w:tc>
@@ -4701,7 +4701,7 @@
                 <w:sz w:val="20"/>
                 <w:szCs w:val="20"/>
               </w:rPr>
-              <w:t xml:space="preserve">054568abef95a9b8749283c6f9f16716</w:t>
+              <w:t xml:space="preserve">a22fb1c7979c76b77582e2cf10bfc5aa</w:t>
             </w:r>
           </w:p>
         </w:tc>
@@ -4755,7 +4755,7 @@
                 <w:sz w:val="20"/>
                 <w:szCs w:val="20"/>
               </w:rPr>
-              <w:t xml:space="preserve">12,4</w:t>
+              <w:t xml:space="preserve">12672</w:t>
             </w:r>
           </w:p>
         </w:tc>
@@ -4781,7 +4781,7 @@
                 <w:sz w:val="20"/>
                 <w:szCs w:val="20"/>
               </w:rPr>
-              <w:t xml:space="preserve">163</w:t>
+              <w:t xml:space="preserve">162</w:t>
             </w:r>
           </w:p>
         </w:tc>
@@ -4861,7 +4861,7 @@
                 <w:sz w:val="20"/>
                 <w:szCs w:val="20"/>
               </w:rPr>
-              <w:t xml:space="preserve">4,6</w:t>
+              <w:t xml:space="preserve">4870</w:t>
             </w:r>
           </w:p>
         </w:tc>
@@ -4913,7 +4913,7 @@
                 <w:sz w:val="20"/>
                 <w:szCs w:val="20"/>
               </w:rPr>
-              <w:t xml:space="preserve">4ed6f24cb37c7b06528501e512582154</w:t>
+              <w:t xml:space="preserve">7dc56dd61e7a14c9d73bd246aef8b927</w:t>
             </w:r>
           </w:p>
         </w:tc>
@@ -4967,7 +4967,7 @@
                 <w:sz w:val="20"/>
                 <w:szCs w:val="20"/>
               </w:rPr>
-              <w:t xml:space="preserve">8,3</w:t>
+              <w:t xml:space="preserve">10631</w:t>
             </w:r>
           </w:p>
         </w:tc>
@@ -4993,7 +4993,7 @@
                 <w:sz w:val="20"/>
                 <w:szCs w:val="20"/>
               </w:rPr>
-              <w:t xml:space="preserve">118</w:t>
+              <w:t xml:space="preserve">130</w:t>
             </w:r>
           </w:p>
         </w:tc>
@@ -5019,7 +5019,7 @@
                 <w:sz w:val="20"/>
                 <w:szCs w:val="20"/>
               </w:rPr>
-              <w:t xml:space="preserve">cadfba71ac86579dee0b78a1941940e3</w:t>
+              <w:t xml:space="preserve">813872ed729e91a678fe2f96519fe816</w:t>
             </w:r>
           </w:p>
         </w:tc>
@@ -5073,7 +5073,7 @@
                 <w:sz w:val="20"/>
                 <w:szCs w:val="20"/>
               </w:rPr>
-              <w:t xml:space="preserve">8,2</w:t>
+              <w:t xml:space="preserve">8435</w:t>
             </w:r>
           </w:p>
         </w:tc>
@@ -5099,7 +5099,7 @@
                 <w:sz w:val="20"/>
                 <w:szCs w:val="20"/>
               </w:rPr>
-              <w:t xml:space="preserve">120</w:t>
+              <w:t xml:space="preserve">119</w:t>
             </w:r>
           </w:p>
         </w:tc>
@@ -5179,7 +5179,7 @@
                 <w:sz w:val="20"/>
                 <w:szCs w:val="20"/>
               </w:rPr>
-              <w:t xml:space="preserve">15,3</w:t>
+              <w:t xml:space="preserve">16493</w:t>
             </w:r>
           </w:p>
         </w:tc>
@@ -5205,7 +5205,7 @@
                 <w:sz w:val="20"/>
                 <w:szCs w:val="20"/>
               </w:rPr>
-              <w:t xml:space="preserve">210</w:t>
+              <w:t xml:space="preserve">213</w:t>
             </w:r>
           </w:p>
         </w:tc>
@@ -5231,7 +5231,7 @@
                 <w:sz w:val="20"/>
                 <w:szCs w:val="20"/>
               </w:rPr>
-              <w:t xml:space="preserve">b47a5cf48c5c1c9e61417b568323a614</w:t>
+              <w:t xml:space="preserve">fadc3e493f10bb057ff315ff5b026642</w:t>
             </w:r>
           </w:p>
         </w:tc>
@@ -5285,7 +5285,7 @@
                 <w:sz w:val="20"/>
                 <w:szCs w:val="20"/>
               </w:rPr>
-              <w:t xml:space="preserve">5,7</w:t>
+              <w:t xml:space="preserve">5957</w:t>
             </w:r>
           </w:p>
         </w:tc>
@@ -5337,7 +5337,7 @@
                 <w:sz w:val="20"/>
                 <w:szCs w:val="20"/>
               </w:rPr>
-              <w:t xml:space="preserve">431ec45bbc3f0e1598b9579d81ee2597</w:t>
+              <w:t xml:space="preserve">62889d077a5229b627242abceca360d0</w:t>
             </w:r>
           </w:p>
         </w:tc>
@@ -5391,7 +5391,7 @@
                 <w:sz w:val="20"/>
                 <w:szCs w:val="20"/>
               </w:rPr>
-              <w:t xml:space="preserve">9,7</w:t>
+              <w:t xml:space="preserve">10921</w:t>
             </w:r>
           </w:p>
         </w:tc>
@@ -5417,7 +5417,7 @@
                 <w:sz w:val="20"/>
                 <w:szCs w:val="20"/>
               </w:rPr>
-              <w:t xml:space="preserve">109</w:t>
+              <w:t xml:space="preserve">117</w:t>
             </w:r>
           </w:p>
         </w:tc>
@@ -5443,7 +5443,7 @@
                 <w:sz w:val="20"/>
                 <w:szCs w:val="20"/>
               </w:rPr>
-              <w:t xml:space="preserve">04138f880bac208d535556f52edee0cd</w:t>
+              <w:t xml:space="preserve">38eb249f60f1233048a6055fbf5a83b2</w:t>
             </w:r>
           </w:p>
         </w:tc>
@@ -5497,7 +5497,7 @@
                 <w:sz w:val="20"/>
                 <w:szCs w:val="20"/>
               </w:rPr>
-              <w:t xml:space="preserve">1,7</w:t>
+              <w:t xml:space="preserve">1730</w:t>
             </w:r>
           </w:p>
         </w:tc>
@@ -5523,7 +5523,7 @@
                 <w:sz w:val="20"/>
                 <w:szCs w:val="20"/>
               </w:rPr>
-              <w:t xml:space="preserve">25</w:t>
+              <w:t xml:space="preserve">24</w:t>
             </w:r>
           </w:p>
         </w:tc>
@@ -5603,7 +5603,7 @@
                 <w:sz w:val="20"/>
                 <w:szCs w:val="20"/>
               </w:rPr>
-              <w:t xml:space="preserve">0,5</w:t>
+              <w:t xml:space="preserve">531</w:t>
             </w:r>
           </w:p>
         </w:tc>
@@ -5629,7 +5629,7 @@
                 <w:sz w:val="20"/>
                 <w:szCs w:val="20"/>
               </w:rPr>
-              <w:t xml:space="preserve">15</w:t>
+              <w:t xml:space="preserve">14</w:t>
             </w:r>
           </w:p>
         </w:tc>
@@ -5709,7 +5709,7 @@
                 <w:sz w:val="20"/>
                 <w:szCs w:val="20"/>
               </w:rPr>
-              <w:t xml:space="preserve">17,6</w:t>
+              <w:t xml:space="preserve">19285</w:t>
             </w:r>
           </w:p>
         </w:tc>
@@ -5735,7 +5735,7 @@
                 <w:sz w:val="20"/>
                 <w:szCs w:val="20"/>
               </w:rPr>
-              <w:t xml:space="preserve">179</w:t>
+              <w:t xml:space="preserve">185</w:t>
             </w:r>
           </w:p>
         </w:tc>
@@ -5761,7 +5761,7 @@
                 <w:sz w:val="20"/>
                 <w:szCs w:val="20"/>
               </w:rPr>
-              <w:t xml:space="preserve">973edb7d5313c666cafc89ecad3e795f</w:t>
+              <w:t xml:space="preserve">8d60de7bd589a0de4aa99d326d5a7310</w:t>
             </w:r>
           </w:p>
         </w:tc>
@@ -5815,7 +5815,7 @@
                 <w:sz w:val="20"/>
                 <w:szCs w:val="20"/>
               </w:rPr>
-              <w:t xml:space="preserve">0,9</w:t>
+              <w:t xml:space="preserve">878</w:t>
             </w:r>
           </w:p>
         </w:tc>
@@ -5841,7 +5841,7 @@
                 <w:sz w:val="20"/>
                 <w:szCs w:val="20"/>
               </w:rPr>
-              <w:t xml:space="preserve">11</w:t>
+              <w:t xml:space="preserve">10</w:t>
             </w:r>
           </w:p>
         </w:tc>
@@ -5895,7 +5895,7 @@
                 <w:sz w:val="20"/>
                 <w:szCs w:val="20"/>
               </w:rPr>
-              <w:t xml:space="preserve">run_analysis.R</w:t>
+              <w:t xml:space="preserve">docs/user_guide.md</w:t>
             </w:r>
           </w:p>
         </w:tc>
@@ -5921,7 +5921,7 @@
                 <w:sz w:val="20"/>
                 <w:szCs w:val="20"/>
               </w:rPr>
-              <w:t xml:space="preserve">1,3</w:t>
+              <w:t xml:space="preserve">7749</w:t>
             </w:r>
           </w:p>
         </w:tc>
@@ -5947,7 +5947,7 @@
                 <w:sz w:val="20"/>
                 <w:szCs w:val="20"/>
               </w:rPr>
-              <w:t xml:space="preserve">20</w:t>
+              <w:t xml:space="preserve">47</w:t>
             </w:r>
           </w:p>
         </w:tc>
@@ -5973,7 +5973,7 @@
                 <w:sz w:val="20"/>
                 <w:szCs w:val="20"/>
               </w:rPr>
-              <w:t xml:space="preserve">da0e84f387a03b0c71c6388144caff57</w:t>
+              <w:t xml:space="preserve">af2450ea6032fcaeae5a0861555eb198</w:t>
             </w:r>
           </w:p>
         </w:tc>
@@ -6001,7 +6001,7 @@
                 <w:sz w:val="20"/>
                 <w:szCs w:val="20"/>
               </w:rPr>
-              <w:t xml:space="preserve">start_urometabr.sh</w:t>
+              <w:t xml:space="preserve">run_analysis.R</w:t>
             </w:r>
           </w:p>
         </w:tc>
@@ -6027,7 +6027,7 @@
                 <w:sz w:val="20"/>
                 <w:szCs w:val="20"/>
               </w:rPr>
-              <w:t xml:space="preserve">0,1</w:t>
+              <w:t xml:space="preserve">1351</w:t>
             </w:r>
           </w:p>
         </w:tc>
@@ -6053,7 +6053,7 @@
                 <w:sz w:val="20"/>
                 <w:szCs w:val="20"/>
               </w:rPr>
-              <w:t xml:space="preserve">4</w:t>
+              <w:t xml:space="preserve">19</w:t>
             </w:r>
           </w:p>
         </w:tc>
@@ -6079,7 +6079,7 @@
                 <w:sz w:val="20"/>
                 <w:szCs w:val="20"/>
               </w:rPr>
-              <w:t xml:space="preserve">02c5405a949566c80ca7381c580b2a11</w:t>
+              <w:t xml:space="preserve">da0e84f387a03b0c71c6388144caff57</w:t>
             </w:r>
           </w:p>
         </w:tc>
@@ -6107,6 +6107,112 @@
                 <w:sz w:val="20"/>
                 <w:szCs w:val="20"/>
               </w:rPr>
+              <w:t xml:space="preserve">start_urometabr.sh</w:t>
+            </w:r>
+          </w:p>
+        </w:tc>
+        <w:tc>
+          <w:tcPr>
+            <w:tcW w:type="dxa" w:w="1123"/>
+            <w:tcMar>
+              <w:top w:type="dxa" w:w="40"/>
+              <w:left w:type="dxa" w:w="80"/>
+              <w:bottom w:type="dxa" w:w="40"/>
+              <w:right w:type="dxa" w:w="80"/>
+            </w:tcMar>
+          </w:tcPr>
+          <w:p>
+            <w:pPr>
+              <w:spacing w:after="0"/>
+            </w:pPr>
+            <w:r>
+              <w:rPr>
+                <w:rFonts w:ascii="Times New Roman" w:cs="Times New Roman" w:eastAsia="Times New Roman" w:hAnsi="Times New Roman"/>
+                <w:b w:val="false"/>
+                <w:bCs w:val="false"/>
+                <w:sz w:val="20"/>
+                <w:szCs w:val="20"/>
+              </w:rPr>
+              <w:t xml:space="preserve">151</w:t>
+            </w:r>
+          </w:p>
+        </w:tc>
+        <w:tc>
+          <w:tcPr>
+            <w:tcW w:type="dxa" w:w="936"/>
+            <w:tcMar>
+              <w:top w:type="dxa" w:w="40"/>
+              <w:left w:type="dxa" w:w="80"/>
+              <w:bottom w:type="dxa" w:w="40"/>
+              <w:right w:type="dxa" w:w="80"/>
+            </w:tcMar>
+          </w:tcPr>
+          <w:p>
+            <w:pPr>
+              <w:spacing w:after="0"/>
+            </w:pPr>
+            <w:r>
+              <w:rPr>
+                <w:rFonts w:ascii="Times New Roman" w:cs="Times New Roman" w:eastAsia="Times New Roman" w:hAnsi="Times New Roman"/>
+                <w:b w:val="false"/>
+                <w:bCs w:val="false"/>
+                <w:sz w:val="20"/>
+                <w:szCs w:val="20"/>
+              </w:rPr>
+              <w:t xml:space="preserve">3</w:t>
+            </w:r>
+          </w:p>
+        </w:tc>
+        <w:tc>
+          <w:tcPr>
+            <w:tcW w:type="dxa" w:w="3367"/>
+            <w:tcMar>
+              <w:top w:type="dxa" w:w="40"/>
+              <w:left w:type="dxa" w:w="80"/>
+              <w:bottom w:type="dxa" w:w="40"/>
+              <w:right w:type="dxa" w:w="80"/>
+            </w:tcMar>
+          </w:tcPr>
+          <w:p>
+            <w:pPr>
+              <w:spacing w:after="0"/>
+            </w:pPr>
+            <w:r>
+              <w:rPr>
+                <w:rFonts w:ascii="Times New Roman" w:cs="Times New Roman" w:eastAsia="Times New Roman" w:hAnsi="Times New Roman"/>
+                <w:b w:val="false"/>
+                <w:bCs w:val="false"/>
+                <w:sz w:val="20"/>
+                <w:szCs w:val="20"/>
+              </w:rPr>
+              <w:t xml:space="preserve">02c5405a949566c80ca7381c580b2a11</w:t>
+            </w:r>
+          </w:p>
+        </w:tc>
+      </w:tr>
+      <w:tr>
+        <w:tc>
+          <w:tcPr>
+            <w:tcW w:type="dxa" w:w="3929"/>
+            <w:tcMar>
+              <w:top w:type="dxa" w:w="40"/>
+              <w:left w:type="dxa" w:w="80"/>
+              <w:bottom w:type="dxa" w:w="40"/>
+              <w:right w:type="dxa" w:w="80"/>
+            </w:tcMar>
+          </w:tcPr>
+          <w:p>
+            <w:pPr>
+              <w:spacing w:after="0"/>
+            </w:pPr>
+            <w:r>
+              <w:rPr>
+                <w:rFonts w:ascii="Times New Roman" w:cs="Times New Roman" w:eastAsia="Times New Roman" w:hAnsi="Times New Roman"/>
+                <w:b w:val="false"/>
+                <w:bCs w:val="false"/>
+                <w:sz w:val="20"/>
+                <w:szCs w:val="20"/>
+              </w:rPr>
               <w:t xml:space="preserve">templates/report.Rmd</w:t>
             </w:r>
           </w:p>
@@ -6133,7 +6239,7 @@
                 <w:sz w:val="20"/>
                 <w:szCs w:val="20"/>
               </w:rPr>
-              <w:t xml:space="preserve">0,9</w:t>
+              <w:t xml:space="preserve">936</w:t>
             </w:r>
           </w:p>
         </w:tc>
@@ -6159,7 +6265,7 @@
                 <w:sz w:val="20"/>
                 <w:szCs w:val="20"/>
               </w:rPr>
-              <w:t xml:space="preserve">32</w:t>
+              <w:t xml:space="preserve">31</w:t>
             </w:r>
           </w:p>
         </w:tc>
@@ -6187,6 +6293,102 @@
               </w:rPr>
               <w:t xml:space="preserve">b15b4b340e3e7935d5bbb1d77d81b245</w:t>
             </w:r>
+          </w:p>
+        </w:tc>
+      </w:tr>
+      <w:tr>
+        <w:tc>
+          <w:tcPr>
+            <w:tcW w:type="dxa" w:w="3929"/>
+            <w:tcMar>
+              <w:top w:type="dxa" w:w="40"/>
+              <w:left w:type="dxa" w:w="80"/>
+              <w:bottom w:type="dxa" w:w="40"/>
+              <w:right w:type="dxa" w:w="80"/>
+            </w:tcMar>
+          </w:tcPr>
+          <w:p>
+            <w:pPr>
+              <w:spacing w:after="0"/>
+            </w:pPr>
+            <w:r>
+              <w:rPr>
+                <w:rFonts w:ascii="Times New Roman" w:cs="Times New Roman" w:eastAsia="Times New Roman" w:hAnsi="Times New Roman"/>
+                <w:b w:val="false"/>
+                <w:bCs w:val="false"/>
+                <w:sz w:val="20"/>
+                <w:szCs w:val="20"/>
+              </w:rPr>
+              <w:t xml:space="preserve">Итого</w:t>
+            </w:r>
+          </w:p>
+        </w:tc>
+        <w:tc>
+          <w:tcPr>
+            <w:tcW w:type="dxa" w:w="1123"/>
+            <w:tcMar>
+              <w:top w:type="dxa" w:w="40"/>
+              <w:left w:type="dxa" w:w="80"/>
+              <w:bottom w:type="dxa" w:w="40"/>
+              <w:right w:type="dxa" w:w="80"/>
+            </w:tcMar>
+          </w:tcPr>
+          <w:p>
+            <w:pPr>
+              <w:spacing w:after="0"/>
+            </w:pPr>
+            <w:r>
+              <w:rPr>
+                <w:rFonts w:ascii="Times New Roman" w:cs="Times New Roman" w:eastAsia="Times New Roman" w:hAnsi="Times New Roman"/>
+                <w:b w:val="false"/>
+                <w:bCs w:val="false"/>
+                <w:sz w:val="20"/>
+                <w:szCs w:val="20"/>
+              </w:rPr>
+              <w:t xml:space="preserve">117 260</w:t>
+            </w:r>
+          </w:p>
+        </w:tc>
+        <w:tc>
+          <w:tcPr>
+            <w:tcW w:type="dxa" w:w="936"/>
+            <w:tcMar>
+              <w:top w:type="dxa" w:w="40"/>
+              <w:left w:type="dxa" w:w="80"/>
+              <w:bottom w:type="dxa" w:w="40"/>
+              <w:right w:type="dxa" w:w="80"/>
+            </w:tcMar>
+          </w:tcPr>
+          <w:p>
+            <w:pPr>
+              <w:spacing w:after="0"/>
+            </w:pPr>
+            <w:r>
+              <w:rPr>
+                <w:rFonts w:ascii="Times New Roman" w:cs="Times New Roman" w:eastAsia="Times New Roman" w:hAnsi="Times New Roman"/>
+                <w:b w:val="false"/>
+                <w:bCs w:val="false"/>
+                <w:sz w:val="20"/>
+                <w:szCs w:val="20"/>
+              </w:rPr>
+              <w:t xml:space="preserve">1448</w:t>
+            </w:r>
+          </w:p>
+        </w:tc>
+        <w:tc>
+          <w:tcPr>
+            <w:tcW w:type="dxa" w:w="3367"/>
+            <w:tcMar>
+              <w:top w:type="dxa" w:w="40"/>
+              <w:left w:type="dxa" w:w="80"/>
+              <w:bottom w:type="dxa" w:w="40"/>
+              <w:right w:type="dxa" w:w="80"/>
+            </w:tcMar>
+          </w:tcPr>
+          <w:p>
+            <w:pPr>
+              <w:spacing w:after="0"/>
+            </w:pPr>
           </w:p>
         </w:tc>
       </w:tr>

</xml_diff>

<commit_message>
Installation for non-specialists: step-by-step guide, installation checklist, troubleshooting; example dataset; personal package library without admin rights; R search in LOCALAPPDATA; UTF-8 sourcing for R 4.0-4.1
Co-Authored-By: Claude Opus 5.5 <noreply@anthropic.com>
Claude-Session: https://claude.ai/code/session_013Wpb2gRPMcSAyp5VyyUtQh
</commit_message>
<xml_diff>
--- a/dist/UroMetabR_v1.0.0_komplekt_registracii.docx
+++ b/dist/UroMetabR_v1.0.0_komplekt_registracii.docx
@@ -521,7 +521,7 @@
                 <w:sz w:val="20"/>
                 <w:szCs w:val="20"/>
               </w:rPr>
-              <w:t xml:space="preserve">117 260 байт (114,5 КБ) исходного кода: 17 файлов, 1448 строк; с тестами и генераторами контрольных данных — 162,6 КБ (22 файлов)</w:t>
+              <w:t xml:space="preserve">128 579 байт (125,6 КБ) исходного кода: 17 файлов, 1537 строк; с тестами и генераторами контрольных данных — 173,6 КБ (22 файлов)</w:t>
             </w:r>
           </w:p>
         </w:tc>
@@ -5497,7 +5497,7 @@
                 <w:sz w:val="20"/>
                 <w:szCs w:val="20"/>
               </w:rPr>
-              <w:t xml:space="preserve">1730</w:t>
+              <w:t xml:space="preserve">2939</w:t>
             </w:r>
           </w:p>
         </w:tc>
@@ -5523,7 +5523,7 @@
                 <w:sz w:val="20"/>
                 <w:szCs w:val="20"/>
               </w:rPr>
-              <w:t xml:space="preserve">24</w:t>
+              <w:t xml:space="preserve">42</w:t>
             </w:r>
           </w:p>
         </w:tc>
@@ -5549,7 +5549,7 @@
                 <w:sz w:val="20"/>
                 <w:szCs w:val="20"/>
               </w:rPr>
-              <w:t xml:space="preserve">14e1f48ab00b7519648a408334533044</w:t>
+              <w:t xml:space="preserve">dc3852f8b2785f0f9db70714cdf6d9e9</w:t>
             </w:r>
           </w:p>
         </w:tc>
@@ -5603,7 +5603,7 @@
                 <w:sz w:val="20"/>
                 <w:szCs w:val="20"/>
               </w:rPr>
-              <w:t xml:space="preserve">531</w:t>
+              <w:t xml:space="preserve">931</w:t>
             </w:r>
           </w:p>
         </w:tc>
@@ -5629,7 +5629,7 @@
                 <w:sz w:val="20"/>
                 <w:szCs w:val="20"/>
               </w:rPr>
-              <w:t xml:space="preserve">14</w:t>
+              <w:t xml:space="preserve">20</w:t>
             </w:r>
           </w:p>
         </w:tc>
@@ -5655,7 +5655,7 @@
                 <w:sz w:val="20"/>
                 <w:szCs w:val="20"/>
               </w:rPr>
-              <w:t xml:space="preserve">75c9848be3920c4d21b624f2b39c3510</w:t>
+              <w:t xml:space="preserve">9b9b1b5ed4d7caed4f41ee0db074af71</w:t>
             </w:r>
           </w:p>
         </w:tc>
@@ -5815,7 +5815,7 @@
                 <w:sz w:val="20"/>
                 <w:szCs w:val="20"/>
               </w:rPr>
-              <w:t xml:space="preserve">878</w:t>
+              <w:t xml:space="preserve">1360</w:t>
             </w:r>
           </w:p>
         </w:tc>
@@ -5841,7 +5841,7 @@
                 <w:sz w:val="20"/>
                 <w:szCs w:val="20"/>
               </w:rPr>
-              <w:t xml:space="preserve">10</w:t>
+              <w:t xml:space="preserve">13</w:t>
             </w:r>
           </w:p>
         </w:tc>
@@ -5867,7 +5867,7 @@
                 <w:sz w:val="20"/>
                 <w:szCs w:val="20"/>
               </w:rPr>
-              <w:t xml:space="preserve">0ca8f00d316809a30ecf4e26c79c099f</w:t>
+              <w:t xml:space="preserve">1a1ed147f07c35c8443e2c248dd9e98c</w:t>
             </w:r>
           </w:p>
         </w:tc>
@@ -5921,7 +5921,7 @@
                 <w:sz w:val="20"/>
                 <w:szCs w:val="20"/>
               </w:rPr>
-              <w:t xml:space="preserve">7749</w:t>
+              <w:t xml:space="preserve">16977</w:t>
             </w:r>
           </w:p>
         </w:tc>
@@ -5947,7 +5947,7 @@
                 <w:sz w:val="20"/>
                 <w:szCs w:val="20"/>
               </w:rPr>
-              <w:t xml:space="preserve">47</w:t>
+              <w:t xml:space="preserve">109</w:t>
             </w:r>
           </w:p>
         </w:tc>
@@ -5973,7 +5973,7 @@
                 <w:sz w:val="20"/>
                 <w:szCs w:val="20"/>
               </w:rPr>
-              <w:t xml:space="preserve">af2450ea6032fcaeae5a0861555eb198</w:t>
+              <w:t xml:space="preserve">9295d6c944372ccf3a845b2a7a2f74fc</w:t>
             </w:r>
           </w:p>
         </w:tc>
@@ -6345,7 +6345,7 @@
                 <w:sz w:val="20"/>
                 <w:szCs w:val="20"/>
               </w:rPr>
-              <w:t xml:space="preserve">117 260</w:t>
+              <w:t xml:space="preserve">128 579</w:t>
             </w:r>
           </w:p>
         </w:tc>
@@ -6371,7 +6371,7 @@
                 <w:sz w:val="20"/>
                 <w:szCs w:val="20"/>
               </w:rPr>
-              <w:t xml:space="preserve">1448</w:t>
+              <w:t xml:space="preserve">1537</w:t>
             </w:r>
           </w:p>
         </w:tc>

</xml_diff>

<commit_message>
Package table: remove packages not used in v1.0 (ProteoMM, FactoMineR, factoextra, tuple)
Co-Authored-By: Claude Opus 5.5 <noreply@anthropic.com>
Claude-Session: https://claude.ai/code/session_013Wpb2gRPMcSAyp5VyyUtQh
</commit_message>
<xml_diff>
--- a/dist/UroMetabR_v1.0.0_komplekt_registracii.docx
+++ b/dist/UroMetabR_v1.0.0_komplekt_registracii.docx
@@ -3801,534 +3801,6 @@
                 <w:szCs w:val="20"/>
               </w:rPr>
               <w:t xml:space="preserve">модуль 5: альтернатива встроенному заполнению (необязательно)</w:t>
-            </w:r>
-          </w:p>
-        </w:tc>
-      </w:tr>
-      <w:tr>
-        <w:tc>
-          <w:tcPr>
-            <w:tcW w:type="dxa" w:w="1310"/>
-            <w:tcMar>
-              <w:top w:type="dxa" w:w="40"/>
-              <w:left w:type="dxa" w:w="80"/>
-              <w:bottom w:type="dxa" w:w="40"/>
-              <w:right w:type="dxa" w:w="80"/>
-            </w:tcMar>
-          </w:tcPr>
-          <w:p>
-            <w:pPr>
-              <w:spacing w:after="0"/>
-            </w:pPr>
-            <w:r>
-              <w:rPr>
-                <w:rFonts w:ascii="Times New Roman" w:cs="Times New Roman" w:eastAsia="Times New Roman" w:hAnsi="Times New Roman"/>
-                <w:b w:val="false"/>
-                <w:bCs w:val="false"/>
-                <w:sz w:val="20"/>
-                <w:szCs w:val="20"/>
-              </w:rPr>
-              <w:t xml:space="preserve">ProteoMM*</w:t>
-            </w:r>
-          </w:p>
-        </w:tc>
-        <w:tc>
-          <w:tcPr>
-            <w:tcW w:type="dxa" w:w="1216"/>
-            <w:tcMar>
-              <w:top w:type="dxa" w:w="40"/>
-              <w:left w:type="dxa" w:w="80"/>
-              <w:bottom w:type="dxa" w:w="40"/>
-              <w:right w:type="dxa" w:w="80"/>
-            </w:tcMar>
-          </w:tcPr>
-          <w:p>
-            <w:pPr>
-              <w:spacing w:after="0"/>
-            </w:pPr>
-            <w:r>
-              <w:rPr>
-                <w:rFonts w:ascii="Times New Roman" w:cs="Times New Roman" w:eastAsia="Times New Roman" w:hAnsi="Times New Roman"/>
-                <w:b w:val="false"/>
-                <w:bCs w:val="false"/>
-                <w:sz w:val="20"/>
-                <w:szCs w:val="20"/>
-              </w:rPr>
-              <w:t xml:space="preserve">Bioconductor</w:t>
-            </w:r>
-          </w:p>
-        </w:tc>
-        <w:tc>
-          <w:tcPr>
-            <w:tcW w:type="dxa" w:w="1216"/>
-            <w:tcMar>
-              <w:top w:type="dxa" w:w="40"/>
-              <w:left w:type="dxa" w:w="80"/>
-              <w:bottom w:type="dxa" w:w="40"/>
-              <w:right w:type="dxa" w:w="80"/>
-            </w:tcMar>
-          </w:tcPr>
-          <w:p>
-            <w:pPr>
-              <w:spacing w:after="0"/>
-            </w:pPr>
-            <w:r>
-              <w:rPr>
-                <w:rFonts w:ascii="Times New Roman" w:cs="Times New Roman" w:eastAsia="Times New Roman" w:hAnsi="Times New Roman"/>
-                <w:b w:val="false"/>
-                <w:bCs w:val="false"/>
-                <w:sz w:val="20"/>
-                <w:szCs w:val="20"/>
-              </w:rPr>
-              <w:t xml:space="preserve">—</w:t>
-            </w:r>
-          </w:p>
-        </w:tc>
-        <w:tc>
-          <w:tcPr>
-            <w:tcW w:type="dxa" w:w="2058"/>
-            <w:tcMar>
-              <w:top w:type="dxa" w:w="40"/>
-              <w:left w:type="dxa" w:w="80"/>
-              <w:bottom w:type="dxa" w:w="40"/>
-              <w:right w:type="dxa" w:w="80"/>
-            </w:tcMar>
-          </w:tcPr>
-          <w:p>
-            <w:pPr>
-              <w:spacing w:after="0"/>
-            </w:pPr>
-            <w:r>
-              <w:rPr>
-                <w:rFonts w:ascii="Times New Roman" w:cs="Times New Roman" w:eastAsia="Times New Roman" w:hAnsi="Times New Roman"/>
-                <w:b w:val="false"/>
-                <w:bCs w:val="false"/>
-                <w:sz w:val="20"/>
-                <w:szCs w:val="20"/>
-              </w:rPr>
-              <w:t xml:space="preserve">MIT</w:t>
-            </w:r>
-          </w:p>
-        </w:tc>
-        <w:tc>
-          <w:tcPr>
-            <w:tcW w:type="dxa" w:w="3555"/>
-            <w:tcMar>
-              <w:top w:type="dxa" w:w="40"/>
-              <w:left w:type="dxa" w:w="80"/>
-              <w:bottom w:type="dxa" w:w="40"/>
-              <w:right w:type="dxa" w:w="80"/>
-            </w:tcMar>
-          </w:tcPr>
-          <w:p>
-            <w:pPr>
-              <w:spacing w:after="0"/>
-            </w:pPr>
-            <w:r>
-              <w:rPr>
-                <w:rFonts w:ascii="Times New Roman" w:cs="Times New Roman" w:eastAsia="Times New Roman" w:hAnsi="Times New Roman"/>
-                <w:b w:val="false"/>
-                <w:bCs w:val="false"/>
-                <w:sz w:val="20"/>
-                <w:szCs w:val="20"/>
-              </w:rPr>
-              <w:t xml:space="preserve">этап 1 (EigenMS); в v1.0 не используется</w:t>
-            </w:r>
-          </w:p>
-        </w:tc>
-      </w:tr>
-      <w:tr>
-        <w:tc>
-          <w:tcPr>
-            <w:tcW w:type="dxa" w:w="1310"/>
-            <w:tcMar>
-              <w:top w:type="dxa" w:w="40"/>
-              <w:left w:type="dxa" w:w="80"/>
-              <w:bottom w:type="dxa" w:w="40"/>
-              <w:right w:type="dxa" w:w="80"/>
-            </w:tcMar>
-          </w:tcPr>
-          <w:p>
-            <w:pPr>
-              <w:spacing w:after="0"/>
-            </w:pPr>
-            <w:r>
-              <w:rPr>
-                <w:rFonts w:ascii="Times New Roman" w:cs="Times New Roman" w:eastAsia="Times New Roman" w:hAnsi="Times New Roman"/>
-                <w:b w:val="false"/>
-                <w:bCs w:val="false"/>
-                <w:sz w:val="20"/>
-                <w:szCs w:val="20"/>
-              </w:rPr>
-              <w:t xml:space="preserve">FactoMineR*</w:t>
-            </w:r>
-          </w:p>
-        </w:tc>
-        <w:tc>
-          <w:tcPr>
-            <w:tcW w:type="dxa" w:w="1216"/>
-            <w:tcMar>
-              <w:top w:type="dxa" w:w="40"/>
-              <w:left w:type="dxa" w:w="80"/>
-              <w:bottom w:type="dxa" w:w="40"/>
-              <w:right w:type="dxa" w:w="80"/>
-            </w:tcMar>
-          </w:tcPr>
-          <w:p>
-            <w:pPr>
-              <w:spacing w:after="0"/>
-            </w:pPr>
-            <w:r>
-              <w:rPr>
-                <w:rFonts w:ascii="Times New Roman" w:cs="Times New Roman" w:eastAsia="Times New Roman" w:hAnsi="Times New Roman"/>
-                <w:b w:val="false"/>
-                <w:bCs w:val="false"/>
-                <w:sz w:val="20"/>
-                <w:szCs w:val="20"/>
-              </w:rPr>
-              <w:t xml:space="preserve">CRAN</w:t>
-            </w:r>
-          </w:p>
-        </w:tc>
-        <w:tc>
-          <w:tcPr>
-            <w:tcW w:type="dxa" w:w="1216"/>
-            <w:tcMar>
-              <w:top w:type="dxa" w:w="40"/>
-              <w:left w:type="dxa" w:w="80"/>
-              <w:bottom w:type="dxa" w:w="40"/>
-              <w:right w:type="dxa" w:w="80"/>
-            </w:tcMar>
-          </w:tcPr>
-          <w:p>
-            <w:pPr>
-              <w:spacing w:after="0"/>
-            </w:pPr>
-            <w:r>
-              <w:rPr>
-                <w:rFonts w:ascii="Times New Roman" w:cs="Times New Roman" w:eastAsia="Times New Roman" w:hAnsi="Times New Roman"/>
-                <w:b w:val="false"/>
-                <w:bCs w:val="false"/>
-                <w:sz w:val="20"/>
-                <w:szCs w:val="20"/>
-              </w:rPr>
-              <w:t xml:space="preserve">—</w:t>
-            </w:r>
-          </w:p>
-        </w:tc>
-        <w:tc>
-          <w:tcPr>
-            <w:tcW w:type="dxa" w:w="2058"/>
-            <w:tcMar>
-              <w:top w:type="dxa" w:w="40"/>
-              <w:left w:type="dxa" w:w="80"/>
-              <w:bottom w:type="dxa" w:w="40"/>
-              <w:right w:type="dxa" w:w="80"/>
-            </w:tcMar>
-          </w:tcPr>
-          <w:p>
-            <w:pPr>
-              <w:spacing w:after="0"/>
-            </w:pPr>
-            <w:r>
-              <w:rPr>
-                <w:rFonts w:ascii="Times New Roman" w:cs="Times New Roman" w:eastAsia="Times New Roman" w:hAnsi="Times New Roman"/>
-                <w:b w:val="false"/>
-                <w:bCs w:val="false"/>
-                <w:sz w:val="20"/>
-                <w:szCs w:val="20"/>
-              </w:rPr>
-              <w:t xml:space="preserve">GPL (&gt;= 2)</w:t>
-            </w:r>
-          </w:p>
-        </w:tc>
-        <w:tc>
-          <w:tcPr>
-            <w:tcW w:type="dxa" w:w="3555"/>
-            <w:tcMar>
-              <w:top w:type="dxa" w:w="40"/>
-              <w:left w:type="dxa" w:w="80"/>
-              <w:bottom w:type="dxa" w:w="40"/>
-              <w:right w:type="dxa" w:w="80"/>
-            </w:tcMar>
-          </w:tcPr>
-          <w:p>
-            <w:pPr>
-              <w:spacing w:after="0"/>
-            </w:pPr>
-            <w:r>
-              <w:rPr>
-                <w:rFonts w:ascii="Times New Roman" w:cs="Times New Roman" w:eastAsia="Times New Roman" w:hAnsi="Times New Roman"/>
-                <w:b w:val="false"/>
-                <w:bCs w:val="false"/>
-                <w:sz w:val="20"/>
-                <w:szCs w:val="20"/>
-              </w:rPr>
-              <w:t xml:space="preserve">этап 1 (PCA); в v1.0 не используется</w:t>
-            </w:r>
-          </w:p>
-        </w:tc>
-      </w:tr>
-      <w:tr>
-        <w:tc>
-          <w:tcPr>
-            <w:tcW w:type="dxa" w:w="1310"/>
-            <w:tcMar>
-              <w:top w:type="dxa" w:w="40"/>
-              <w:left w:type="dxa" w:w="80"/>
-              <w:bottom w:type="dxa" w:w="40"/>
-              <w:right w:type="dxa" w:w="80"/>
-            </w:tcMar>
-          </w:tcPr>
-          <w:p>
-            <w:pPr>
-              <w:spacing w:after="0"/>
-            </w:pPr>
-            <w:r>
-              <w:rPr>
-                <w:rFonts w:ascii="Times New Roman" w:cs="Times New Roman" w:eastAsia="Times New Roman" w:hAnsi="Times New Roman"/>
-                <w:b w:val="false"/>
-                <w:bCs w:val="false"/>
-                <w:sz w:val="20"/>
-                <w:szCs w:val="20"/>
-              </w:rPr>
-              <w:t xml:space="preserve">factoextra*</w:t>
-            </w:r>
-          </w:p>
-        </w:tc>
-        <w:tc>
-          <w:tcPr>
-            <w:tcW w:type="dxa" w:w="1216"/>
-            <w:tcMar>
-              <w:top w:type="dxa" w:w="40"/>
-              <w:left w:type="dxa" w:w="80"/>
-              <w:bottom w:type="dxa" w:w="40"/>
-              <w:right w:type="dxa" w:w="80"/>
-            </w:tcMar>
-          </w:tcPr>
-          <w:p>
-            <w:pPr>
-              <w:spacing w:after="0"/>
-            </w:pPr>
-            <w:r>
-              <w:rPr>
-                <w:rFonts w:ascii="Times New Roman" w:cs="Times New Roman" w:eastAsia="Times New Roman" w:hAnsi="Times New Roman"/>
-                <w:b w:val="false"/>
-                <w:bCs w:val="false"/>
-                <w:sz w:val="20"/>
-                <w:szCs w:val="20"/>
-              </w:rPr>
-              <w:t xml:space="preserve">CRAN</w:t>
-            </w:r>
-          </w:p>
-        </w:tc>
-        <w:tc>
-          <w:tcPr>
-            <w:tcW w:type="dxa" w:w="1216"/>
-            <w:tcMar>
-              <w:top w:type="dxa" w:w="40"/>
-              <w:left w:type="dxa" w:w="80"/>
-              <w:bottom w:type="dxa" w:w="40"/>
-              <w:right w:type="dxa" w:w="80"/>
-            </w:tcMar>
-          </w:tcPr>
-          <w:p>
-            <w:pPr>
-              <w:spacing w:after="0"/>
-            </w:pPr>
-            <w:r>
-              <w:rPr>
-                <w:rFonts w:ascii="Times New Roman" w:cs="Times New Roman" w:eastAsia="Times New Roman" w:hAnsi="Times New Roman"/>
-                <w:b w:val="false"/>
-                <w:bCs w:val="false"/>
-                <w:sz w:val="20"/>
-                <w:szCs w:val="20"/>
-              </w:rPr>
-              <w:t xml:space="preserve">—</w:t>
-            </w:r>
-          </w:p>
-        </w:tc>
-        <w:tc>
-          <w:tcPr>
-            <w:tcW w:type="dxa" w:w="2058"/>
-            <w:tcMar>
-              <w:top w:type="dxa" w:w="40"/>
-              <w:left w:type="dxa" w:w="80"/>
-              <w:bottom w:type="dxa" w:w="40"/>
-              <w:right w:type="dxa" w:w="80"/>
-            </w:tcMar>
-          </w:tcPr>
-          <w:p>
-            <w:pPr>
-              <w:spacing w:after="0"/>
-            </w:pPr>
-            <w:r>
-              <w:rPr>
-                <w:rFonts w:ascii="Times New Roman" w:cs="Times New Roman" w:eastAsia="Times New Roman" w:hAnsi="Times New Roman"/>
-                <w:b w:val="false"/>
-                <w:bCs w:val="false"/>
-                <w:sz w:val="20"/>
-                <w:szCs w:val="20"/>
-              </w:rPr>
-              <w:t xml:space="preserve">GPL-2</w:t>
-            </w:r>
-          </w:p>
-        </w:tc>
-        <w:tc>
-          <w:tcPr>
-            <w:tcW w:type="dxa" w:w="3555"/>
-            <w:tcMar>
-              <w:top w:type="dxa" w:w="40"/>
-              <w:left w:type="dxa" w:w="80"/>
-              <w:bottom w:type="dxa" w:w="40"/>
-              <w:right w:type="dxa" w:w="80"/>
-            </w:tcMar>
-          </w:tcPr>
-          <w:p>
-            <w:pPr>
-              <w:spacing w:after="0"/>
-            </w:pPr>
-            <w:r>
-              <w:rPr>
-                <w:rFonts w:ascii="Times New Roman" w:cs="Times New Roman" w:eastAsia="Times New Roman" w:hAnsi="Times New Roman"/>
-                <w:b w:val="false"/>
-                <w:bCs w:val="false"/>
-                <w:sz w:val="20"/>
-                <w:szCs w:val="20"/>
-              </w:rPr>
-              <w:t xml:space="preserve">этап 1 (графики PCA); в v1.0 не используется</w:t>
-            </w:r>
-          </w:p>
-        </w:tc>
-      </w:tr>
-      <w:tr>
-        <w:tc>
-          <w:tcPr>
-            <w:tcW w:type="dxa" w:w="1310"/>
-            <w:tcMar>
-              <w:top w:type="dxa" w:w="40"/>
-              <w:left w:type="dxa" w:w="80"/>
-              <w:bottom w:type="dxa" w:w="40"/>
-              <w:right w:type="dxa" w:w="80"/>
-            </w:tcMar>
-          </w:tcPr>
-          <w:p>
-            <w:pPr>
-              <w:spacing w:after="0"/>
-            </w:pPr>
-            <w:r>
-              <w:rPr>
-                <w:rFonts w:ascii="Times New Roman" w:cs="Times New Roman" w:eastAsia="Times New Roman" w:hAnsi="Times New Roman"/>
-                <w:b w:val="false"/>
-                <w:bCs w:val="false"/>
-                <w:sz w:val="20"/>
-                <w:szCs w:val="20"/>
-              </w:rPr>
-              <w:t xml:space="preserve">tuple*</w:t>
-            </w:r>
-          </w:p>
-        </w:tc>
-        <w:tc>
-          <w:tcPr>
-            <w:tcW w:type="dxa" w:w="1216"/>
-            <w:tcMar>
-              <w:top w:type="dxa" w:w="40"/>
-              <w:left w:type="dxa" w:w="80"/>
-              <w:bottom w:type="dxa" w:w="40"/>
-              <w:right w:type="dxa" w:w="80"/>
-            </w:tcMar>
-          </w:tcPr>
-          <w:p>
-            <w:pPr>
-              <w:spacing w:after="0"/>
-            </w:pPr>
-            <w:r>
-              <w:rPr>
-                <w:rFonts w:ascii="Times New Roman" w:cs="Times New Roman" w:eastAsia="Times New Roman" w:hAnsi="Times New Roman"/>
-                <w:b w:val="false"/>
-                <w:bCs w:val="false"/>
-                <w:sz w:val="20"/>
-                <w:szCs w:val="20"/>
-              </w:rPr>
-              <w:t xml:space="preserve">CRAN (архив)</w:t>
-            </w:r>
-          </w:p>
-        </w:tc>
-        <w:tc>
-          <w:tcPr>
-            <w:tcW w:type="dxa" w:w="1216"/>
-            <w:tcMar>
-              <w:top w:type="dxa" w:w="40"/>
-              <w:left w:type="dxa" w:w="80"/>
-              <w:bottom w:type="dxa" w:w="40"/>
-              <w:right w:type="dxa" w:w="80"/>
-            </w:tcMar>
-          </w:tcPr>
-          <w:p>
-            <w:pPr>
-              <w:spacing w:after="0"/>
-            </w:pPr>
-            <w:r>
-              <w:rPr>
-                <w:rFonts w:ascii="Times New Roman" w:cs="Times New Roman" w:eastAsia="Times New Roman" w:hAnsi="Times New Roman"/>
-                <w:b w:val="false"/>
-                <w:bCs w:val="false"/>
-                <w:sz w:val="20"/>
-                <w:szCs w:val="20"/>
-              </w:rPr>
-              <w:t xml:space="preserve">—</w:t>
-            </w:r>
-          </w:p>
-        </w:tc>
-        <w:tc>
-          <w:tcPr>
-            <w:tcW w:type="dxa" w:w="2058"/>
-            <w:tcMar>
-              <w:top w:type="dxa" w:w="40"/>
-              <w:left w:type="dxa" w:w="80"/>
-              <w:bottom w:type="dxa" w:w="40"/>
-              <w:right w:type="dxa" w:w="80"/>
-            </w:tcMar>
-          </w:tcPr>
-          <w:p>
-            <w:pPr>
-              <w:spacing w:after="0"/>
-            </w:pPr>
-            <w:r>
-              <w:rPr>
-                <w:rFonts w:ascii="Times New Roman" w:cs="Times New Roman" w:eastAsia="Times New Roman" w:hAnsi="Times New Roman"/>
-                <w:b w:val="false"/>
-                <w:bCs w:val="false"/>
-                <w:sz w:val="20"/>
-                <w:szCs w:val="20"/>
-              </w:rPr>
-              <w:t xml:space="preserve">проверить</w:t>
-            </w:r>
-          </w:p>
-        </w:tc>
-        <w:tc>
-          <w:tcPr>
-            <w:tcW w:type="dxa" w:w="3555"/>
-            <w:tcMar>
-              <w:top w:type="dxa" w:w="40"/>
-              <w:left w:type="dxa" w:w="80"/>
-              <w:bottom w:type="dxa" w:w="40"/>
-              <w:right w:type="dxa" w:w="80"/>
-            </w:tcMar>
-          </w:tcPr>
-          <w:p>
-            <w:pPr>
-              <w:spacing w:after="0"/>
-            </w:pPr>
-            <w:r>
-              <w:rPr>
-                <w:rFonts w:ascii="Times New Roman" w:cs="Times New Roman" w:eastAsia="Times New Roman" w:hAnsi="Times New Roman"/>
-                <w:b w:val="false"/>
-                <w:bCs w:val="false"/>
-                <w:sz w:val="20"/>
-                <w:szCs w:val="20"/>
-              </w:rPr>
-              <w:t xml:space="preserve">этап 1 (tuplicated); в v1.0 не используется</w:t>
             </w:r>
           </w:p>
         </w:tc>

</xml_diff>